<commit_message>
LAB: publish clone-based exercises covering all five command pipelines
</commit_message>
<xml_diff>
--- a/Lab6_Report_Template.docx
+++ b/Lab6_Report_Template.docx
@@ -31,7 +31,7 @@
         <w:pStyle w:val="Heading2"/>
       </w:pPr>
       <w:r>
-        <w:t>1 Set up a shared project repository</w:t>
+        <w:t>1 Clone the shared project baseline</w:t>
       </w:r>
     </w:p>
     <w:p>
@@ -39,7 +39,7 @@
         <w:rPr>
           <w:b w:val="0"/>
         </w:rPr>
-        <w:t>Why is a shared versioned repository useful to a software development team?</w:t>
+        <w:t>How do init and clone differ, and why does the team use a common starter project?</w:t>
       </w:r>
     </w:p>
     <w:p>
@@ -55,7 +55,7 @@
         <w:rPr>
           <w:b w:val="0"/>
         </w:rPr>
-        <w:t>S1: your GitHub repository page after the first push. Show the public repository name and README content in the same screenshot.</w:t>
+        <w:t>S1: one terminal screenshot showing successful clone output, git remote -v and git log --oneline -1. The origin URL must point to your own public repository.</w:t>
       </w:r>
     </w:p>
     <w:p>
@@ -248,7 +248,7 @@
         <w:pStyle w:val="Heading2"/>
       </w:pPr>
       <w:r>
-        <w:t>4 Merge a release checklist</w:t>
+        <w:t>4 Prepare and integrate a release checklist</w:t>
       </w:r>
     </w:p>
     <w:p>
@@ -256,7 +256,7 @@
         <w:rPr>
           <w:b w:val="0"/>
         </w:rPr>
-        <w:t>Why use a separate branch when preparing a release checklist?</w:t>
+        <w:t>How do branch, rebase and merge help a manager integrate a feature?</w:t>
       </w:r>
     </w:p>
     <w:p>
@@ -272,7 +272,7 @@
         <w:rPr>
           <w:b w:val="0"/>
         </w:rPr>
-        <w:t>S4: one terminal screenshot showing the branch graph and release-checklist.md content.</w:t>
+        <w:t>S4: one terminal screenshot showing successful rebase output, the final branch graph and release-checklist.md content.</w:t>
       </w:r>
     </w:p>
     <w:p>
@@ -329,7 +329,7 @@
         <w:pStyle w:val="Heading2"/>
       </w:pPr>
       <w:r>
-        <w:t>5 Undo an uncommitted edit</w:t>
+        <w:t>5 Inspect and correct project records</w:t>
       </w:r>
     </w:p>
     <w:p>
@@ -337,7 +337,7 @@
         <w:rPr>
           <w:b w:val="0"/>
         </w:rPr>
-        <w:t>Why should a team inspect a document change before discarding it?</w:t>
+        <w:t>Why use revert for a shared mistake, but restore or reset for local corrections?</w:t>
       </w:r>
     </w:p>
     <w:p>
@@ -353,7 +353,7 @@
         <w:rPr>
           <w:b w:val="0"/>
         </w:rPr>
-        <w:t>S5: one terminal screenshot showing the temporary line in git diff, followed by the restored README and clean status.</w:t>
+        <w:t>S5: one terminal screenshot showing the staged diff after soft reset, the ERROR and Revert commits, and the final clean status.</w:t>
       </w:r>
     </w:p>
     <w:p>

</xml_diff>

<commit_message>
Clarify terminal workflow and simplify screenshot evidence
</commit_message>
<xml_diff>
--- a/Lab6_Report_Template.docx
+++ b/Lab6_Report_Template.docx
@@ -55,7 +55,7 @@
         <w:rPr>
           <w:b w:val="0"/>
         </w:rPr>
-        <w:t>S1: one terminal screenshot showing successful clone output, git remote -v and git log --oneline -1. The origin URL must point to your own public repository.</w:t>
+        <w:t>S1: one terminal screenshot showing git remote -v and git log --oneline -1. The origin URL must point to your own public repository.</w:t>
       </w:r>
     </w:p>
     <w:p>
@@ -272,7 +272,7 @@
         <w:rPr>
           <w:b w:val="0"/>
         </w:rPr>
-        <w:t>S4: one terminal screenshot showing successful rebase output, the final branch graph and release-checklist.md content.</w:t>
+        <w:t>S4: one terminal screenshot showing the final branch graph and release-checklist.md content.</w:t>
       </w:r>
     </w:p>
     <w:p>
@@ -353,7 +353,7 @@
         <w:rPr>
           <w:b w:val="0"/>
         </w:rPr>
-        <w:t>S5: one terminal screenshot showing the staged diff after soft reset, the ERROR and Revert commits, and the final clean status.</w:t>
+        <w:t>S5: one terminal screenshot showing the ERROR and Revert commits, the final README.md content and git status --short with no output.</w:t>
       </w:r>
     </w:p>
     <w:p>

</xml_diff>